<commit_message>
docs: add architecture diagram and update problem statement document
</commit_message>
<xml_diff>
--- a/AuraFlow - Problem Statement.docx
+++ b/AuraFlow - Problem Statement.docx
@@ -46,6 +46,9 @@
       </w:r>
     </w:p>
     <w:p>
+      <w:pPr>
+        <w:ind w:firstLine="720"/>
+      </w:pPr>
       <w:r>
         <w:t xml:space="preserve">My name is Mugdha </w:t>
       </w:r>
@@ -55,14 +58,6 @@
       <w:r>
         <w:t xml:space="preserve"> I am a Technical Program Manager from San Francisco Bay Area. </w:t>
       </w:r>
-    </w:p>
-    <w:p>
-      <w:pPr>
-        <w:rPr>
-          <w:b/>
-          <w:bCs/>
-        </w:rPr>
-      </w:pPr>
       <w:r>
         <w:t xml:space="preserve">I am happy to participate in the </w:t>
       </w:r>
@@ -71,7 +66,23 @@
           <w:b/>
           <w:bCs/>
         </w:rPr>
-        <w:t>AI Agents: Intensive Vibe Coding Capstone Project</w:t>
+        <w:t xml:space="preserve">AI Agents: Intensive </w:t>
+      </w:r>
+      <w:proofErr w:type="gramStart"/>
+      <w:r>
+        <w:rPr>
+          <w:b/>
+          <w:bCs/>
+        </w:rPr>
+        <w:t>Vibe Coding</w:t>
+      </w:r>
+      <w:proofErr w:type="gramEnd"/>
+      <w:r>
+        <w:rPr>
+          <w:b/>
+          <w:bCs/>
+        </w:rPr>
+        <w:t xml:space="preserve"> Capstone Project</w:t>
       </w:r>
       <w:r>
         <w:rPr>
@@ -80,8 +91,13 @@
         </w:rPr>
         <w:t xml:space="preserve"> by Google X Kaggle</w:t>
       </w:r>
-    </w:p>
-    <w:p>
+      <w:r>
+        <w:rPr>
+          <w:b/>
+          <w:bCs/>
+        </w:rPr>
+        <w:t xml:space="preserve">. </w:t>
+      </w:r>
       <w:r>
         <w:t>My project is in the Category of “</w:t>
       </w:r>
@@ -96,7 +112,24 @@
         <w:t>”</w:t>
       </w:r>
       <w:r>
-        <w:t xml:space="preserve">, where I built an application for Women’s Period tracking Buddy. </w:t>
+        <w:t>, where I built an application for Women’s Period tracking Buddy</w:t>
+      </w:r>
+      <w:r>
+        <w:t xml:space="preserve"> with </w:t>
+      </w:r>
+      <w:r>
+        <w:rPr>
+          <w:b/>
+          <w:bCs/>
+        </w:rPr>
+        <w:t>Empathetic Companion Agent</w:t>
+      </w:r>
+      <w:r>
+        <w:rPr>
+          <w:b/>
+          <w:bCs/>
+        </w:rPr>
+        <w:t>.</w:t>
       </w:r>
     </w:p>
     <w:p>
@@ -112,8 +145,133 @@
         </w:r>
       </w:hyperlink>
     </w:p>
+    <w:p>
+      <w:pPr>
+        <w:rPr>
+          <w:b/>
+          <w:bCs/>
+        </w:rPr>
+      </w:pPr>
+    </w:p>
+    <w:p>
+      <w:pPr>
+        <w:rPr>
+          <w:rStyle w:val="IntenseReference"/>
+        </w:rPr>
+      </w:pPr>
+      <w:r>
+        <w:rPr>
+          <w:rStyle w:val="IntenseReference"/>
+        </w:rPr>
+        <w:t>Honoring Your Cycle, Harmonizing Your Life.</w:t>
+      </w:r>
+    </w:p>
+    <w:p>
+      <w:proofErr w:type="spellStart"/>
+      <w:r>
+        <w:t>AuraFlow</w:t>
+      </w:r>
+      <w:proofErr w:type="spellEnd"/>
+      <w:r>
+        <w:t xml:space="preserve"> is an elegant, empathetic period tracking web application and personal wellness assistant designed specifically to support women through their monthly cycles. By bridging science and empathy, </w:t>
+      </w:r>
+      <w:proofErr w:type="spellStart"/>
+      <w:r>
+        <w:t>AuraFlow</w:t>
+      </w:r>
+      <w:proofErr w:type="spellEnd"/>
+      <w:r>
+        <w:t xml:space="preserve"> acts as a digital companion that listens, tracks, and guides, helping women align their nutrition, workload, and self-care with their body's natural chemistry.</w:t>
+      </w:r>
+    </w:p>
     <w:p/>
     <w:p>
+      <w:r>
+        <w:rPr>
+          <w:b/>
+          <w:bCs/>
+        </w:rPr>
+        <w:t xml:space="preserve">## </w:t>
+      </w:r>
+      <w:r>
+        <w:rPr>
+          <w:rFonts w:ascii="Segoe UI Emoji" w:hAnsi="Segoe UI Emoji" w:cs="Segoe UI Emoji"/>
+          <w:b/>
+          <w:bCs/>
+        </w:rPr>
+        <w:t>🌟</w:t>
+      </w:r>
+      <w:r>
+        <w:rPr>
+          <w:b/>
+          <w:bCs/>
+        </w:rPr>
+        <w:t xml:space="preserve"> The Heart of </w:t>
+      </w:r>
+      <w:proofErr w:type="spellStart"/>
+      <w:r>
+        <w:rPr>
+          <w:b/>
+          <w:bCs/>
+        </w:rPr>
+        <w:t>AuraFlow</w:t>
+      </w:r>
+      <w:proofErr w:type="spellEnd"/>
+      <w:r>
+        <w:rPr>
+          <w:b/>
+          <w:bCs/>
+        </w:rPr>
+        <w:t xml:space="preserve"> (Problem Statement)</w:t>
+      </w:r>
+    </w:p>
+    <w:p>
+      <w:r>
+        <w:t xml:space="preserve">Every month, a woman's body goes through a sacred, complex, and transformative cycle. Society often expects women to maintain constant productivity, mood, and energy levels every single day. In reality, women are cyclical beings. Their hormones, physical strength, emotional capacity, and nutritional needs shift dynamically across four distinct phases: </w:t>
+      </w:r>
+      <w:r>
+        <w:rPr>
+          <w:b/>
+          <w:bCs/>
+        </w:rPr>
+        <w:t>**Menstrual, Follicular, Ovulatory, and Luteal**</w:t>
+      </w:r>
+      <w:r>
+        <w:t>.</w:t>
+      </w:r>
+    </w:p>
+    <w:p>
+      <w:r>
+        <w:t xml:space="preserve">Without understanding, this cycle can feel like a source of distress, frustration, and confusion. </w:t>
+      </w:r>
+      <w:r>
+        <w:rPr>
+          <w:b/>
+          <w:bCs/>
+        </w:rPr>
+        <w:t>**</w:t>
+      </w:r>
+      <w:proofErr w:type="spellStart"/>
+      <w:r>
+        <w:rPr>
+          <w:b/>
+          <w:bCs/>
+        </w:rPr>
+        <w:t>AuraFlow</w:t>
+      </w:r>
+      <w:proofErr w:type="spellEnd"/>
+      <w:r>
+        <w:rPr>
+          <w:b/>
+          <w:bCs/>
+        </w:rPr>
+        <w:t>**</w:t>
+      </w:r>
+      <w:r>
+        <w:t xml:space="preserve"> is created to change this narrative. It turns a monthly challenge into a source of personal empowerment, harmony, and self-love.</w:t>
+      </w:r>
+    </w:p>
+    <w:p>
       <w:pPr>
         <w:rPr>
           <w:b/>
@@ -124,35 +282,47 @@
     <w:p>
       <w:pPr>
         <w:rPr>
-          <w:rStyle w:val="IntenseReference"/>
+          <w:b/>
+          <w:bCs/>
         </w:rPr>
       </w:pPr>
       <w:r>
         <w:rPr>
-          <w:rStyle w:val="IntenseReference"/>
-        </w:rPr>
-        <w:t>&gt; **Honoring Your Cycle, Harmonizing Your Life.**</w:t>
-      </w:r>
-    </w:p>
-    <w:p>
-      <w:proofErr w:type="spellStart"/>
-      <w:r>
-        <w:t>AuraFlow</w:t>
-      </w:r>
-      <w:proofErr w:type="spellEnd"/>
-      <w:r>
-        <w:t xml:space="preserve"> is an elegant, empathetic period tracking web application and personal wellness assistant designed specifically to support women through their monthly cycles. By bridging science and empathy, </w:t>
-      </w:r>
-      <w:proofErr w:type="spellStart"/>
-      <w:r>
-        <w:t>AuraFlow</w:t>
-      </w:r>
-      <w:proofErr w:type="spellEnd"/>
-      <w:r>
-        <w:t xml:space="preserve"> acts as a digital companion that listens, tracks, and guides, helping women align their nutrition, workload, and self-care with their body's natural chemistry.</w:t>
-      </w:r>
-    </w:p>
-    <w:p/>
+          <w:b/>
+          <w:bCs/>
+        </w:rPr>
+        <w:t>### The Role of the Empathetic Companion Agent</w:t>
+      </w:r>
+    </w:p>
+    <w:p>
+      <w:r>
+        <w:t>At the core of this experience is the **Empathetic Companion Agent**. Unlike standard tracker apps that rely on cold, mechanical calculators, this agent acts as a warm, responsive, and intuitive digital companion. It is designed to:</w:t>
+      </w:r>
+    </w:p>
+    <w:p>
+      <w:r>
+        <w:t>- **Actively Listen &amp; Adapt**: It analyzes the physical symptoms, mood states, and notes you log daily, synthesizing these inputs to refine its mood predictions and adjust recommendations dynamically.</w:t>
+      </w:r>
+    </w:p>
+    <w:p>
+      <w:r>
+        <w:lastRenderedPageBreak/>
+        <w:t>- **Provide Compassionate Advice**: Rather than demanding constant output, it helps you align your workload and nutrition with your body's current chemistry, suggesting comforting foods, grounding exercises, and phase-tailored daily checklists.</w:t>
+      </w:r>
+    </w:p>
+    <w:p>
+      <w:r>
+        <w:t>- **Maintain a Protective Presence**: It monitors emotional signals and safety markers. If a user logs thoughts of deep distress or self-harm, the agent steps in to shield them, immediately routing them to warm support and vital crisis resources, demonstrating that they are never truly alone.</w:t>
+      </w:r>
+    </w:p>
+    <w:p>
+      <w:pPr>
+        <w:rPr>
+          <w:b/>
+          <w:bCs/>
+        </w:rPr>
+      </w:pPr>
+    </w:p>
     <w:p>
       <w:r>
         <w:rPr>
@@ -167,93 +337,6 @@
           <w:b/>
           <w:bCs/>
         </w:rPr>
-        <w:t>🌟</w:t>
-      </w:r>
-      <w:r>
-        <w:rPr>
-          <w:b/>
-          <w:bCs/>
-        </w:rPr>
-        <w:t xml:space="preserve"> The Heart of </w:t>
-      </w:r>
-      <w:proofErr w:type="spellStart"/>
-      <w:r>
-        <w:rPr>
-          <w:b/>
-          <w:bCs/>
-        </w:rPr>
-        <w:t>AuraFlow</w:t>
-      </w:r>
-      <w:proofErr w:type="spellEnd"/>
-      <w:r>
-        <w:rPr>
-          <w:b/>
-          <w:bCs/>
-        </w:rPr>
-        <w:t xml:space="preserve"> (Problem Statement)</w:t>
-      </w:r>
-    </w:p>
-    <w:p>
-      <w:r>
-        <w:t xml:space="preserve">Every month, a woman's body goes through a sacred, complex, and transformative cycle. Society often expects women to maintain constant productivity, mood, and energy levels every single day. In reality, women are cyclical beings. Their hormones, physical strength, emotional capacity, and nutritional needs shift dynamically across four distinct phases: </w:t>
-      </w:r>
-      <w:r>
-        <w:rPr>
-          <w:b/>
-          <w:bCs/>
-        </w:rPr>
-        <w:t>**Menstrual, Follicular, Ovulatory, and Luteal**</w:t>
-      </w:r>
-      <w:r>
-        <w:t>.</w:t>
-      </w:r>
-    </w:p>
-    <w:p/>
-    <w:p>
-      <w:r>
-        <w:t xml:space="preserve">Without understanding, this cycle can feel like a source of distress, frustration, and confusion. </w:t>
-      </w:r>
-      <w:r>
-        <w:rPr>
-          <w:b/>
-          <w:bCs/>
-        </w:rPr>
-        <w:t>**</w:t>
-      </w:r>
-      <w:proofErr w:type="spellStart"/>
-      <w:r>
-        <w:rPr>
-          <w:b/>
-          <w:bCs/>
-        </w:rPr>
-        <w:t>AuraFlow</w:t>
-      </w:r>
-      <w:proofErr w:type="spellEnd"/>
-      <w:r>
-        <w:rPr>
-          <w:b/>
-          <w:bCs/>
-        </w:rPr>
-        <w:t>**</w:t>
-      </w:r>
-      <w:r>
-        <w:t xml:space="preserve"> is created to change this narrative. It turns a monthly challenge into a source of personal empowerment, harmony, and self-love.</w:t>
-      </w:r>
-    </w:p>
-    <w:p>
-      <w:r>
-        <w:rPr>
-          <w:b/>
-          <w:bCs/>
-        </w:rPr>
-        <w:t xml:space="preserve">## </w:t>
-      </w:r>
-      <w:r>
-        <w:rPr>
-          <w:rFonts w:ascii="Segoe UI Emoji" w:hAnsi="Segoe UI Emoji" w:cs="Segoe UI Emoji"/>
-          <w:b/>
-          <w:bCs/>
-        </w:rPr>
         <w:t>✨</w:t>
       </w:r>
       <w:r>
@@ -281,7 +364,6 @@
     </w:p>
     <w:p>
       <w:r>
-        <w:lastRenderedPageBreak/>
         <w:t xml:space="preserve">  - </w:t>
       </w:r>
       <w:r>
@@ -298,34 +380,19 @@
           <w:i/>
           <w:iCs/>
         </w:rPr>
-        <w:t>*Menstrual Phase (Crimson / Soft Rose)*</w:t>
-      </w:r>
-      <w:r>
-        <w:t>: representing rest, warmth, and release.</w:t>
-      </w:r>
-    </w:p>
-    <w:p>
-      <w:r>
-        <w:t xml:space="preserve">  - </w:t>
-      </w:r>
-      <w:r>
-        <w:rPr>
-          <w:rFonts w:ascii="Segoe UI Emoji" w:hAnsi="Segoe UI Emoji" w:cs="Segoe UI Emoji"/>
-        </w:rPr>
-        <w:t>🌱</w:t>
-      </w:r>
-      <w:r>
-        <w:t xml:space="preserve"> </w:t>
-      </w:r>
+        <w:t xml:space="preserve">*Menstrual Phase (Crimson / Soft </w:t>
+      </w:r>
+      <w:proofErr w:type="gramStart"/>
       <w:r>
         <w:rPr>
           <w:i/>
           <w:iCs/>
         </w:rPr>
-        <w:t>*Follicular Phase (Sage Green / Spring Blossom)*</w:t>
-      </w:r>
-      <w:r>
-        <w:t>: representing renewal, energy, and growth.</w:t>
+        <w:t>Rose)*</w:t>
+      </w:r>
+      <w:proofErr w:type="gramEnd"/>
+      <w:r>
+        <w:t>: representing rest, warmth, and release.</w:t>
       </w:r>
     </w:p>
     <w:p>
@@ -336,7 +403,7 @@
         <w:rPr>
           <w:rFonts w:ascii="Segoe UI Emoji" w:hAnsi="Segoe UI Emoji" w:cs="Segoe UI Emoji"/>
         </w:rPr>
-        <w:t>☀️</w:t>
+        <w:t>🌱</w:t>
       </w:r>
       <w:r>
         <w:t xml:space="preserve"> </w:t>
@@ -346,32 +413,83 @@
           <w:i/>
           <w:iCs/>
         </w:rPr>
-        <w:t>*Ovulatory Phase (Radiant Coral / Sunny Amber)*</w:t>
-      </w:r>
-      <w:r>
-        <w:t>: representing high energy, social connection, and confidence.</w:t>
-      </w:r>
-    </w:p>
-    <w:p>
-      <w:r>
-        <w:t xml:space="preserve">  - </w:t>
-      </w:r>
-      <w:r>
-        <w:rPr>
-          <w:rFonts w:ascii="Segoe UI Emoji" w:hAnsi="Segoe UI Emoji" w:cs="Segoe UI Emoji"/>
-        </w:rPr>
-        <w:t>🌙</w:t>
-      </w:r>
-      <w:r>
-        <w:t xml:space="preserve"> </w:t>
-      </w:r>
+        <w:t xml:space="preserve">*Follicular Phase (Sage Green / Spring </w:t>
+      </w:r>
+      <w:proofErr w:type="gramStart"/>
       <w:r>
         <w:rPr>
           <w:i/>
           <w:iCs/>
         </w:rPr>
-        <w:t>*Luteal Phase (Midnight Lavender / Soft Gold)*</w:t>
-      </w:r>
+        <w:t>Blossom)*</w:t>
+      </w:r>
+      <w:proofErr w:type="gramEnd"/>
+      <w:r>
+        <w:t>: representing renewal, energy, and growth.</w:t>
+      </w:r>
+    </w:p>
+    <w:p>
+      <w:r>
+        <w:t xml:space="preserve">  - </w:t>
+      </w:r>
+      <w:r>
+        <w:rPr>
+          <w:rFonts w:ascii="Segoe UI Emoji" w:hAnsi="Segoe UI Emoji" w:cs="Segoe UI Emoji"/>
+        </w:rPr>
+        <w:t>☀️</w:t>
+      </w:r>
+      <w:r>
+        <w:t xml:space="preserve"> </w:t>
+      </w:r>
+      <w:r>
+        <w:rPr>
+          <w:i/>
+          <w:iCs/>
+        </w:rPr>
+        <w:t xml:space="preserve">*Ovulatory Phase (Radiant Coral / Sunny </w:t>
+      </w:r>
+      <w:proofErr w:type="gramStart"/>
+      <w:r>
+        <w:rPr>
+          <w:i/>
+          <w:iCs/>
+        </w:rPr>
+        <w:t>Amber)*</w:t>
+      </w:r>
+      <w:proofErr w:type="gramEnd"/>
+      <w:r>
+        <w:t>: representing high energy, social connection, and confidence.</w:t>
+      </w:r>
+    </w:p>
+    <w:p>
+      <w:r>
+        <w:t xml:space="preserve">  - </w:t>
+      </w:r>
+      <w:r>
+        <w:rPr>
+          <w:rFonts w:ascii="Segoe UI Emoji" w:hAnsi="Segoe UI Emoji" w:cs="Segoe UI Emoji"/>
+        </w:rPr>
+        <w:t>🌙</w:t>
+      </w:r>
+      <w:r>
+        <w:t xml:space="preserve"> </w:t>
+      </w:r>
+      <w:r>
+        <w:rPr>
+          <w:i/>
+          <w:iCs/>
+        </w:rPr>
+        <w:t xml:space="preserve">*Luteal Phase (Midnight Lavender / Soft </w:t>
+      </w:r>
+      <w:proofErr w:type="gramStart"/>
+      <w:r>
+        <w:rPr>
+          <w:i/>
+          <w:iCs/>
+        </w:rPr>
+        <w:t>Gold)*</w:t>
+      </w:r>
+      <w:proofErr w:type="gramEnd"/>
       <w:r>
         <w:t>: representing nesting, reflection, and winding down.</w:t>
       </w:r>
@@ -475,6 +593,15 @@
       </w:r>
     </w:p>
     <w:p/>
+    <w:p/>
+    <w:p/>
+    <w:p/>
+    <w:p/>
+    <w:p/>
+    <w:p/>
+    <w:p/>
+    <w:p/>
+    <w:p/>
     <w:p>
       <w:r>
         <w:rPr>
@@ -499,382 +626,142 @@
         <w:t xml:space="preserve"> Architectural Overview</w:t>
       </w:r>
     </w:p>
+    <w:p>
+      <w:r>
+        <w:rPr>
+          <w:noProof/>
+        </w:rPr>
+        <w:drawing>
+          <wp:inline distT="0" distB="0" distL="0" distR="0" wp14:anchorId="0739BEBB" wp14:editId="4CD7C681">
+            <wp:extent cx="5731510" cy="3820795"/>
+            <wp:effectExtent l="0" t="0" r="2540" b="8255"/>
+            <wp:docPr id="1915876396" name="Picture 3"/>
+            <wp:cNvGraphicFramePr>
+              <a:graphicFrameLocks xmlns:a="http://schemas.openxmlformats.org/drawingml/2006/main" noChangeAspect="1"/>
+            </wp:cNvGraphicFramePr>
+            <a:graphic xmlns:a="http://schemas.openxmlformats.org/drawingml/2006/main">
+              <a:graphicData uri="http://schemas.openxmlformats.org/drawingml/2006/picture">
+                <pic:pic xmlns:pic="http://schemas.openxmlformats.org/drawingml/2006/picture">
+                  <pic:nvPicPr>
+                    <pic:cNvPr id="0" name="Picture 8"/>
+                    <pic:cNvPicPr>
+                      <a:picLocks noChangeAspect="1" noChangeArrowheads="1"/>
+                    </pic:cNvPicPr>
+                  </pic:nvPicPr>
+                  <pic:blipFill>
+                    <a:blip r:embed="rId5" cstate="print">
+                      <a:extLst>
+                        <a:ext uri="{28A0092B-C50C-407E-A947-70E740481C1C}">
+                          <a14:useLocalDpi xmlns:a14="http://schemas.microsoft.com/office/drawing/2010/main" val="0"/>
+                        </a:ext>
+                      </a:extLst>
+                    </a:blip>
+                    <a:srcRect/>
+                    <a:stretch>
+                      <a:fillRect/>
+                    </a:stretch>
+                  </pic:blipFill>
+                  <pic:spPr bwMode="auto">
+                    <a:xfrm>
+                      <a:off x="0" y="0"/>
+                      <a:ext cx="5731510" cy="3820795"/>
+                    </a:xfrm>
+                    <a:prstGeom prst="rect">
+                      <a:avLst/>
+                    </a:prstGeom>
+                    <a:noFill/>
+                    <a:ln>
+                      <a:noFill/>
+                    </a:ln>
+                  </pic:spPr>
+                </pic:pic>
+              </a:graphicData>
+            </a:graphic>
+          </wp:inline>
+        </w:drawing>
+      </w:r>
+    </w:p>
+    <w:p>
+      <w:r>
+        <w:rPr>
+          <w:noProof/>
+        </w:rPr>
+        <mc:AlternateContent>
+          <mc:Choice Requires="wps">
+            <w:drawing>
+              <wp:inline distT="0" distB="0" distL="0" distR="0" wp14:anchorId="7EADE76B" wp14:editId="01A18AF5">
+                <wp:extent cx="304800" cy="304800"/>
+                <wp:effectExtent l="0" t="0" r="0" b="0"/>
+                <wp:docPr id="152878526" name="Rectangle 1" descr="Software architecture flowchart diagram"/>
+                <wp:cNvGraphicFramePr>
+                  <a:graphicFrameLocks xmlns:a="http://schemas.openxmlformats.org/drawingml/2006/main" noChangeAspect="1"/>
+                </wp:cNvGraphicFramePr>
+                <a:graphic xmlns:a="http://schemas.openxmlformats.org/drawingml/2006/main">
+                  <a:graphicData uri="http://schemas.microsoft.com/office/word/2010/wordprocessingShape">
+                    <wps:wsp>
+                      <wps:cNvSpPr>
+                        <a:spLocks noChangeAspect="1" noChangeArrowheads="1"/>
+                      </wps:cNvSpPr>
+                      <wps:spPr bwMode="auto">
+                        <a:xfrm>
+                          <a:off x="0" y="0"/>
+                          <a:ext cx="304800" cy="304800"/>
+                        </a:xfrm>
+                        <a:prstGeom prst="rect">
+                          <a:avLst/>
+                        </a:prstGeom>
+                        <a:noFill/>
+                        <a:ln>
+                          <a:noFill/>
+                        </a:ln>
+                        <a:extLst>
+                          <a:ext uri="{909E8E84-426E-40DD-AFC4-6F175D3DCCD1}">
+                            <a14:hiddenFill xmlns:a14="http://schemas.microsoft.com/office/drawing/2010/main">
+                              <a:solidFill>
+                                <a:srgbClr val="FFFFFF"/>
+                              </a:solidFill>
+                            </a14:hiddenFill>
+                          </a:ext>
+                          <a:ext uri="{91240B29-F687-4F45-9708-019B960494DF}">
+                            <a14:hiddenLine xmlns:a14="http://schemas.microsoft.com/office/drawing/2010/main" w="9525">
+                              <a:solidFill>
+                                <a:srgbClr val="000000"/>
+                              </a:solidFill>
+                              <a:miter lim="800000"/>
+                              <a:headEnd/>
+                              <a:tailEnd/>
+                            </a14:hiddenLine>
+                          </a:ext>
+                        </a:extLst>
+                      </wps:spPr>
+                      <wps:bodyPr rot="0" vert="horz" wrap="square" lIns="91440" tIns="45720" rIns="91440" bIns="45720" anchor="t" anchorCtr="0" upright="1">
+                        <a:noAutofit/>
+                      </wps:bodyPr>
+                    </wps:wsp>
+                  </a:graphicData>
+                </a:graphic>
+              </wp:inline>
+            </w:drawing>
+          </mc:Choice>
+          <mc:Fallback>
+            <w:pict>
+              <v:rect w14:anchorId="653D8211" id="Rectangle 1" o:spid="_x0000_s1026" alt="Software architecture flowchart diagram" style="width:24pt;height:24pt;visibility:visible;mso-wrap-style:square;mso-left-percent:-10001;mso-top-percent:-10001;mso-position-horizontal:absolute;mso-position-horizontal-relative:char;mso-position-vertical:absolute;mso-position-vertical-relative:line;mso-left-percent:-10001;mso-top-percent:-10001;v-text-anchor:top" o:gfxdata="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" filled="f" stroked="f">
+                <o:lock v:ext="edit" aspectratio="t"/>
+                <w10:anchorlock/>
+              </v:rect>
+            </w:pict>
+          </mc:Fallback>
+        </mc:AlternateContent>
+      </w:r>
+    </w:p>
+    <w:p>
+      <w:r>
+        <w:t>---</w:t>
+      </w:r>
+    </w:p>
     <w:p/>
     <w:p>
       <w:r>
-        <w:t>```mermaid</w:t>
-      </w:r>
-    </w:p>
-    <w:p>
-      <w:r>
-        <w:t>graph TD</w:t>
-      </w:r>
-    </w:p>
-    <w:p>
-      <w:r>
-        <w:t>    subgraph Client Browser (User Interface)</w:t>
-      </w:r>
-    </w:p>
-    <w:p>
-      <w:r>
-        <w:t>        UI[</w:t>
-      </w:r>
-      <w:proofErr w:type="spellStart"/>
-      <w:r>
-        <w:t>AuraFlow</w:t>
-      </w:r>
-      <w:proofErr w:type="spellEnd"/>
-      <w:r>
-        <w:t xml:space="preserve"> Dashboard UI] &lt;--&gt; </w:t>
-      </w:r>
-      <w:proofErr w:type="spellStart"/>
-      <w:r>
-        <w:t>AppLogic</w:t>
-      </w:r>
-      <w:proofErr w:type="spellEnd"/>
-      <w:r>
-        <w:t>[Application Engine / JS Controller]</w:t>
-      </w:r>
-    </w:p>
-    <w:p>
-      <w:r>
-        <w:t xml:space="preserve">        UI &lt;--&gt; </w:t>
-      </w:r>
-      <w:proofErr w:type="spellStart"/>
-      <w:r>
-        <w:t>ThemeManager</w:t>
-      </w:r>
-      <w:proofErr w:type="spellEnd"/>
-      <w:r>
-        <w:t>[Dynamic Phase Theme Engine]</w:t>
-      </w:r>
-    </w:p>
-    <w:p>
-      <w:r>
-        <w:t>    end</w:t>
-      </w:r>
-    </w:p>
-    <w:p/>
-    <w:p>
-      <w:r>
-        <w:lastRenderedPageBreak/>
-        <w:t>    subgraph Logic &amp; Processing (Empathetic Companion Agent)</w:t>
-      </w:r>
-    </w:p>
-    <w:p>
-      <w:r>
-        <w:t xml:space="preserve">        </w:t>
-      </w:r>
-      <w:proofErr w:type="spellStart"/>
-      <w:r>
-        <w:t>AppLogic</w:t>
-      </w:r>
-      <w:proofErr w:type="spellEnd"/>
-      <w:r>
-        <w:t xml:space="preserve"> --&gt; </w:t>
-      </w:r>
-      <w:proofErr w:type="spellStart"/>
-      <w:r>
-        <w:t>CycleCalculator</w:t>
-      </w:r>
-      <w:proofErr w:type="spellEnd"/>
-      <w:r>
-        <w:t>[Cycle &amp; Phase Predictor]</w:t>
-      </w:r>
-    </w:p>
-    <w:p>
-      <w:r>
-        <w:t xml:space="preserve">        </w:t>
-      </w:r>
-      <w:proofErr w:type="spellStart"/>
-      <w:r>
-        <w:t>AppLogic</w:t>
-      </w:r>
-      <w:proofErr w:type="spellEnd"/>
-      <w:r>
-        <w:t xml:space="preserve"> --&gt; </w:t>
-      </w:r>
-      <w:proofErr w:type="spellStart"/>
-      <w:r>
-        <w:t>SafetyGuard</w:t>
-      </w:r>
-      <w:proofErr w:type="spellEnd"/>
-      <w:r>
-        <w:t>[Guardrail &amp; Safety Filter]</w:t>
-      </w:r>
-    </w:p>
-    <w:p>
-      <w:r>
-        <w:t xml:space="preserve">        </w:t>
-      </w:r>
-      <w:proofErr w:type="spellStart"/>
-      <w:r>
-        <w:t>AppLogic</w:t>
-      </w:r>
-      <w:proofErr w:type="spellEnd"/>
-      <w:r>
-        <w:t xml:space="preserve"> --&gt; </w:t>
-      </w:r>
-      <w:proofErr w:type="spellStart"/>
-      <w:r>
-        <w:t>RecGenerator</w:t>
-      </w:r>
-      <w:proofErr w:type="spellEnd"/>
-      <w:r>
-        <w:t>[Personalized Recommendations Engine]</w:t>
-      </w:r>
-    </w:p>
-    <w:p>
-      <w:r>
-        <w:t xml:space="preserve">        </w:t>
-      </w:r>
-    </w:p>
-    <w:p>
-      <w:r>
-        <w:t xml:space="preserve">        </w:t>
-      </w:r>
-      <w:proofErr w:type="spellStart"/>
-      <w:r>
-        <w:t>RecGenerator</w:t>
-      </w:r>
-      <w:proofErr w:type="spellEnd"/>
-      <w:r>
-        <w:t xml:space="preserve"> --&gt; </w:t>
-      </w:r>
-      <w:proofErr w:type="spellStart"/>
-      <w:r>
-        <w:t>MoodPredictor</w:t>
-      </w:r>
-      <w:proofErr w:type="spellEnd"/>
-      <w:r>
-        <w:t>[Mood Prediction Engine]</w:t>
-      </w:r>
-    </w:p>
-    <w:p>
-      <w:r>
-        <w:t xml:space="preserve">        </w:t>
-      </w:r>
-      <w:proofErr w:type="spellStart"/>
-      <w:r>
-        <w:t>RecGenerator</w:t>
-      </w:r>
-      <w:proofErr w:type="spellEnd"/>
-      <w:r>
-        <w:t xml:space="preserve"> --&gt; </w:t>
-      </w:r>
-      <w:proofErr w:type="spellStart"/>
-      <w:r>
-        <w:t>TaskGen</w:t>
-      </w:r>
-      <w:proofErr w:type="spellEnd"/>
-      <w:r>
-        <w:t>[Daily Task Generator]</w:t>
-      </w:r>
-    </w:p>
-    <w:p>
-      <w:r>
-        <w:t xml:space="preserve">        </w:t>
-      </w:r>
-      <w:proofErr w:type="spellStart"/>
-      <w:r>
-        <w:t>RecGenerator</w:t>
-      </w:r>
-      <w:proofErr w:type="spellEnd"/>
-      <w:r>
-        <w:t xml:space="preserve"> --&gt; </w:t>
-      </w:r>
-      <w:proofErr w:type="spellStart"/>
-      <w:r>
-        <w:t>NutritionGen</w:t>
-      </w:r>
-      <w:proofErr w:type="spellEnd"/>
-      <w:r>
-        <w:t>[Phase-Specific Food Recommender]</w:t>
-      </w:r>
-    </w:p>
-    <w:p>
-      <w:r>
-        <w:t xml:space="preserve">        </w:t>
-      </w:r>
-      <w:proofErr w:type="spellStart"/>
-      <w:r>
-        <w:t>RecGenerator</w:t>
-      </w:r>
-      <w:proofErr w:type="spellEnd"/>
-      <w:r>
-        <w:t xml:space="preserve"> --&gt; </w:t>
-      </w:r>
-      <w:proofErr w:type="spellStart"/>
-      <w:r>
-        <w:t>ThoughtsGen</w:t>
-      </w:r>
-      <w:proofErr w:type="spellEnd"/>
-      <w:r>
-        <w:t>[Uplifting Thoughts &amp; Motivation Generator]</w:t>
-      </w:r>
-    </w:p>
-    <w:p>
-      <w:r>
-        <w:t>    end</w:t>
-      </w:r>
-    </w:p>
-    <w:p/>
-    <w:p>
-      <w:r>
-        <w:t>    subgraph Data &amp; Storage (Persistence)</w:t>
-      </w:r>
-    </w:p>
-    <w:p>
-      <w:r>
-        <w:t xml:space="preserve">        </w:t>
-      </w:r>
-      <w:proofErr w:type="spellStart"/>
-      <w:r>
-        <w:t>AppLogic</w:t>
-      </w:r>
-      <w:proofErr w:type="spellEnd"/>
-      <w:r>
-        <w:t xml:space="preserve"> &lt;--&gt; </w:t>
-      </w:r>
-      <w:proofErr w:type="spellStart"/>
-      <w:r>
-        <w:t>ProfileDb</w:t>
-      </w:r>
-      <w:proofErr w:type="spellEnd"/>
-      <w:r>
-        <w:t xml:space="preserve">[Profile &amp; History Database - </w:t>
-      </w:r>
-      <w:proofErr w:type="spellStart"/>
-      <w:r>
-        <w:t>localStorage</w:t>
-      </w:r>
-      <w:proofErr w:type="spellEnd"/>
-      <w:r>
-        <w:t>]</w:t>
-      </w:r>
-    </w:p>
-    <w:p>
-      <w:r>
-        <w:t>    end</w:t>
-      </w:r>
-    </w:p>
-    <w:p/>
-    <w:p>
-      <w:r>
-        <w:t xml:space="preserve">    </w:t>
-      </w:r>
-      <w:proofErr w:type="spellStart"/>
-      <w:r>
-        <w:t>classDef</w:t>
-      </w:r>
-      <w:proofErr w:type="spellEnd"/>
-      <w:r>
-        <w:t xml:space="preserve"> </w:t>
-      </w:r>
-      <w:proofErr w:type="spellStart"/>
-      <w:r>
-        <w:t>ui</w:t>
-      </w:r>
-      <w:proofErr w:type="spellEnd"/>
-      <w:r>
-        <w:t xml:space="preserve"> fill:#fff0f5,stroke:#ff69b4,stroke-width:2px;</w:t>
-      </w:r>
-    </w:p>
-    <w:p>
-      <w:r>
-        <w:t xml:space="preserve">    </w:t>
-      </w:r>
-      <w:proofErr w:type="spellStart"/>
-      <w:r>
-        <w:t>classDef</w:t>
-      </w:r>
-      <w:proofErr w:type="spellEnd"/>
-      <w:r>
-        <w:t xml:space="preserve"> logic fill:#e6e6fa,stroke:#9370db,stroke-width:2px;</w:t>
-      </w:r>
-    </w:p>
-    <w:p>
-      <w:r>
-        <w:t xml:space="preserve">    </w:t>
-      </w:r>
-      <w:proofErr w:type="spellStart"/>
-      <w:r>
-        <w:t>classDef</w:t>
-      </w:r>
-      <w:proofErr w:type="spellEnd"/>
-      <w:r>
-        <w:t xml:space="preserve"> </w:t>
-      </w:r>
-      <w:proofErr w:type="spellStart"/>
-      <w:r>
-        <w:t>db</w:t>
-      </w:r>
-      <w:proofErr w:type="spellEnd"/>
-      <w:r>
-        <w:t xml:space="preserve"> fill:#f0fff0,stroke:#3cb371,stroke-width:2px;</w:t>
-      </w:r>
-    </w:p>
-    <w:p>
-      <w:r>
-        <w:t xml:space="preserve">    class </w:t>
-      </w:r>
-      <w:proofErr w:type="spellStart"/>
-      <w:r>
-        <w:t>UI,ThemeManager</w:t>
-      </w:r>
-      <w:proofErr w:type="spellEnd"/>
-      <w:r>
-        <w:t xml:space="preserve"> </w:t>
-      </w:r>
-      <w:proofErr w:type="spellStart"/>
-      <w:r>
-        <w:t>ui</w:t>
-      </w:r>
-      <w:proofErr w:type="spellEnd"/>
-      <w:r>
-        <w:t>;</w:t>
-      </w:r>
-    </w:p>
-    <w:p>
-      <w:r>
-        <w:t>    class AppLogic,CycleCalculator,SafetyGuard,RecGenerator,MoodPredictor,TaskGen,NutritionGen,ThoughtsGen logic;</w:t>
-      </w:r>
-    </w:p>
-    <w:p>
-      <w:r>
-        <w:t xml:space="preserve">    class </w:t>
-      </w:r>
-      <w:proofErr w:type="spellStart"/>
-      <w:r>
-        <w:t>ProfileDb</w:t>
-      </w:r>
-      <w:proofErr w:type="spellEnd"/>
-      <w:r>
-        <w:t xml:space="preserve"> </w:t>
-      </w:r>
-      <w:proofErr w:type="spellStart"/>
-      <w:r>
-        <w:t>db</w:t>
-      </w:r>
-      <w:proofErr w:type="spellEnd"/>
-      <w:r>
-        <w:t>;</w:t>
-      </w:r>
-    </w:p>
-    <w:p>
-      <w:r>
-        <w:t>```</w:t>
-      </w:r>
-    </w:p>
-    <w:p/>
-    <w:p>
-      <w:r>
-        <w:t>---</w:t>
-      </w:r>
-    </w:p>
-    <w:p/>
-    <w:p>
-      <w:r>
         <w:rPr>
           <w:b/>
           <w:bCs/>
@@ -895,6 +782,21 @@
           <w:bCs/>
         </w:rPr>
         <w:t xml:space="preserve"> Technology Stack</w:t>
+      </w:r>
+    </w:p>
+    <w:p>
+      <w:r>
+        <w:t xml:space="preserve">- </w:t>
+      </w:r>
+      <w:r>
+        <w:rPr>
+          <w:b/>
+          <w:bCs/>
+        </w:rPr>
+        <w:t>**Structure**</w:t>
+      </w:r>
+      <w:r>
+        <w:t>: Semantic HTML5 markup</w:t>
       </w:r>
     </w:p>
     <w:p>
@@ -907,10 +809,18 @@
           <w:b/>
           <w:bCs/>
         </w:rPr>
-        <w:t>**Structure**</w:t>
-      </w:r>
-      <w:r>
-        <w:t>: Semantic HTML5 markup</w:t>
+        <w:t>**Styling**</w:t>
+      </w:r>
+      <w:r>
+        <w:t xml:space="preserve">: Vanilla CSS3 featuring a premium </w:t>
+      </w:r>
+      <w:proofErr w:type="spellStart"/>
+      <w:r>
+        <w:t>glassmorphic</w:t>
+      </w:r>
+      <w:proofErr w:type="spellEnd"/>
+      <w:r>
+        <w:t xml:space="preserve"> UI, fluid grid layouts, and smooth transition animations</w:t>
       </w:r>
     </w:p>
     <w:p>
@@ -922,18 +832,18 @@
           <w:b/>
           <w:bCs/>
         </w:rPr>
-        <w:t>**Styling**</w:t>
-      </w:r>
-      <w:r>
-        <w:t xml:space="preserve">: Vanilla CSS3 featuring a premium </w:t>
+        <w:t>**Logic**</w:t>
+      </w:r>
+      <w:r>
+        <w:t xml:space="preserve">: Vanilla ES6+ </w:t>
       </w:r>
       <w:proofErr w:type="spellStart"/>
       <w:r>
-        <w:t>glassmorphic</w:t>
+        <w:t>Javascript</w:t>
       </w:r>
       <w:proofErr w:type="spellEnd"/>
       <w:r>
-        <w:t xml:space="preserve"> UI, fluid grid layouts, and smooth transition animations</w:t>
+        <w:t xml:space="preserve"> (Single Page Application architecture)</w:t>
       </w:r>
     </w:p>
     <w:p>
@@ -945,18 +855,18 @@
           <w:b/>
           <w:bCs/>
         </w:rPr>
-        <w:t>**Logic**</w:t>
-      </w:r>
-      <w:r>
-        <w:t xml:space="preserve">: Vanilla ES6+ </w:t>
+        <w:t>**Icons**</w:t>
+      </w:r>
+      <w:r>
+        <w:t xml:space="preserve">: </w:t>
       </w:r>
       <w:proofErr w:type="spellStart"/>
       <w:r>
-        <w:t>Javascript</w:t>
+        <w:t>FontAwesome</w:t>
       </w:r>
       <w:proofErr w:type="spellEnd"/>
       <w:r>
-        <w:t xml:space="preserve"> (Single Page Application architecture)</w:t>
+        <w:t xml:space="preserve"> 6 Vector Icons</w:t>
       </w:r>
     </w:p>
     <w:p>
@@ -968,40 +878,17 @@
           <w:b/>
           <w:bCs/>
         </w:rPr>
-        <w:t>**Icons**</w:t>
-      </w:r>
-      <w:r>
-        <w:t xml:space="preserve">: </w:t>
+        <w:t>**Database**</w:t>
+      </w:r>
+      <w:r>
+        <w:t>: Web Storage API (`</w:t>
       </w:r>
       <w:proofErr w:type="spellStart"/>
       <w:r>
-        <w:t>FontAwesome</w:t>
+        <w:t>localStorage</w:t>
       </w:r>
       <w:proofErr w:type="spellEnd"/>
       <w:r>
-        <w:t xml:space="preserve"> 6 Vector Icons</w:t>
-      </w:r>
-    </w:p>
-    <w:p>
-      <w:r>
-        <w:t xml:space="preserve">- </w:t>
-      </w:r>
-      <w:r>
-        <w:rPr>
-          <w:b/>
-          <w:bCs/>
-        </w:rPr>
-        <w:t>**Database**</w:t>
-      </w:r>
-      <w:r>
-        <w:t>: Web Storage API (`</w:t>
-      </w:r>
-      <w:proofErr w:type="spellStart"/>
-      <w:r>
-        <w:t>localStorage</w:t>
-      </w:r>
-      <w:proofErr w:type="spellEnd"/>
-      <w:r>
         <w:t>`)</w:t>
       </w:r>
     </w:p>
@@ -1012,6 +899,7 @@
       </w:r>
     </w:p>
     <w:p/>
+    <w:p/>
     <w:p>
       <w:r>
         <w:rPr>
@@ -1048,8 +936,13 @@
     </w:p>
     <w:p>
       <w:r>
-        <w:t>Make sure you have [Node.js](</w:t>
-      </w:r>
+        <w:t>Make sure you have [</w:t>
+      </w:r>
+      <w:proofErr w:type="gramStart"/>
+      <w:r>
+        <w:t>Node.js](</w:t>
+      </w:r>
+      <w:proofErr w:type="gramEnd"/>
       <w:r>
         <w:rPr>
           <w:u w:val="single"/>

</xml_diff>